<commit_message>
J13 ClearColumn + saveToLocalStorage
</commit_message>
<xml_diff>
--- a/J13/План.docx
+++ b/J13/План.docx
@@ -1746,7 +1746,16 @@
             <w:pPr>
               <w:spacing w:line="240" w:lineRule="auto"/>
               <w:jc w:val="right"/>
-            </w:pPr>
+              <w:rPr>
+                <w:lang w:val="en-US"/>
+              </w:rPr>
+            </w:pPr>
+            <w:r>
+              <w:rPr>
+                <w:lang w:val="en-US"/>
+              </w:rPr>
+              <w:t>0,1</w:t>
+            </w:r>
           </w:p>
         </w:tc>
         <w:tc>
@@ -2130,7 +2139,16 @@
             <w:pPr>
               <w:spacing w:line="240" w:lineRule="auto"/>
               <w:jc w:val="right"/>
-            </w:pPr>
+              <w:rPr>
+                <w:lang w:val="en-US"/>
+              </w:rPr>
+            </w:pPr>
+            <w:r>
+              <w:rPr>
+                <w:lang w:val="en-US"/>
+              </w:rPr>
+              <w:t>0,5</w:t>
+            </w:r>
           </w:p>
         </w:tc>
         <w:tc>

</xml_diff>